<commit_message>
docs(sba): personalize final report
</commit_message>
<xml_diff>
--- a/docs/sba/mastermind-game-system-report/Mastermind_Game_System_SBA_Report.docx
+++ b/docs/sba/mastermind-game-system-report/Mastermind_Game_System_SBA_Report.docx
@@ -234,7 +234,7 @@
                 <w:color w:val="1F2933"/>
                 <w:sz w:val="18"/>
               </w:rPr>
-              <w:t>____________________________________________</w:t>
+              <w:t>CHAN, YU SHING</w:t>
             </w:r>
           </w:p>
         </w:tc>
@@ -283,7 +283,7 @@
                 <w:color w:val="1F2933"/>
                 <w:sz w:val="18"/>
               </w:rPr>
-              <w:t>____________________________________________</w:t>
+              <w:t>Student ID s202101127</w:t>
             </w:r>
           </w:p>
         </w:tc>
@@ -332,7 +332,7 @@
                 <w:color w:val="1F2933"/>
                 <w:sz w:val="18"/>
               </w:rPr>
-              <w:t>____________________________________________</w:t>
+              <w:t>CCC Ming Kei College</w:t>
             </w:r>
           </w:p>
         </w:tc>
@@ -418,7 +418,7 @@
     </w:p>
     <w:p>
       <w:r>
-        <w:t>This report documents the Mastermind Game System implemented in the accompanying repository. Candidate identity fields are left blank for completion before formal submission. The student should confirm authorship, cite all assistance required by school policy, and retain the tested repository baseline.</w:t>
+        <w:t>This report documents the Mastermind Game System implemented by CHAN, YU SHING (Student ID s202101127) of CCC Ming Kei College in the accompanying repository. The student should confirm authorship, cite all assistance required by school policy, and retain the tested repository baseline.</w:t>
       </w:r>
     </w:p>
     <w:p>
@@ -3350,36 +3350,6 @@
         <w:ind w:left="346"/>
       </w:pPr>
       <w:hyperlink w:anchor="h_91" w:history="1">
-        <w:r>
-          <w:rPr>
-            <w:color w:val="1F2933"/>
-          </w:rPr>
-          <w:t>9.1.2: AI Tools</w:t>
-        </w:r>
-      </w:hyperlink>
-      <w:r>
-        <w:tab/>
-      </w:r>
-      <w:r>
-        <w:rPr>
-          <w:rFonts w:ascii="Arial" w:hAnsi="Arial" w:eastAsia="Arial"/>
-          <w:b w:val="0"/>
-          <w:color w:val="17324D"/>
-          <w:sz w:val="16"/>
-        </w:rPr>
-        <w:t>36</w:t>
-      </w:r>
-    </w:p>
-    <w:p>
-      <w:pPr>
-        <w:keepLines/>
-        <w:tabs>
-          <w:tab w:pos="9864" w:val="right" w:leader="dot"/>
-        </w:tabs>
-        <w:spacing w:after="22"/>
-        <w:ind w:left="346"/>
-      </w:pPr>
-      <w:hyperlink w:anchor="h_92" w:history="1">
         <w:r>
           <w:rPr>
             <w:color w:val="1F2933"/>
@@ -21497,24 +21467,9 @@
         <w:pStyle w:val="Heading2"/>
       </w:pPr>
       <w:r>
-        <w:t>9.1.2: AI Tools</w:t>
+        <w:t>9.2: Gantt Chart</w:t>
       </w:r>
       <w:bookmarkEnd w:id="91"/>
-    </w:p>
-    <w:p>
-      <w:r>
-        <w:t>OpenAI Codex was used as a development and documentation assistant for repository inspection, structured drafting, visual generation, and verification orchestration. Technical claims were checked against source code and executed commands. AI assistance does not replace the student's responsibility to understand, edit, validate, and declare the submitted work according to school and HKEAA requirements.</w:t>
-      </w:r>
-    </w:p>
-    <w:p>
-      <w:bookmarkStart w:id="92" w:name="h_92"/>
-      <w:pPr>
-        <w:pStyle w:val="Heading2"/>
-      </w:pPr>
-      <w:r>
-        <w:t>9.2: Gantt Chart</w:t>
-      </w:r>
-      <w:bookmarkEnd w:id="92"/>
     </w:p>
     <w:p>
       <w:r>

</xml_diff>

<commit_message>
chore(release): refresh v1 installers and report
</commit_message>
<xml_diff>
--- a/docs/sba/mastermind-game-system-report/Mastermind_Game_System_SBA_Report.docx
+++ b/docs/sba/mastermind-game-system-report/Mastermind_Game_System_SBA_Report.docx
@@ -423,7 +423,7 @@
     </w:p>
     <w:p>
       <w:r>
-        <w:t>Technical statements are grounded in source code at commit 31509d956b0bb8614b646887065ee40549238446 and verification executed on 1 September 2026. The report does not claim that every reconstructed debugging scenario corresponds to an individually preserved historical commit; Section 7 identifies the final safeguards and their regression evidence.</w:t>
+        <w:t>Technical statements are grounded in source code at commit 67b4cc9be06961483661bf3219626a4ea2e6014e and verification executed on 1 September 2026. This baseline includes the serialized concurrent-duel repair at commit 13fa42f0d9703f945881610a9a2d89ac7d31446f. The report does not claim that every reconstructed debugging scenario corresponds to an individually preserved historical commit; Section 7 identifies the final safeguards and their regression evidence.</w:t>
       </w:r>
     </w:p>
     <w:tbl>
@@ -603,10 +603,19 @@
         <w:rPr>
           <w:b/>
         </w:rPr>
-        <w:t>136 tests passed</w:t>
-      </w:r>
-      <w:r>
-        <w:t xml:space="preserve">, 8 optional-path tests skipped; focused CLI/core tests achieved </w:t>
+        <w:t>117 Python tests passed</w:t>
+      </w:r>
+      <w:r>
+        <w:t xml:space="preserve"> and </w:t>
+      </w:r>
+      <w:r>
+        <w:rPr>
+          <w:b/>
+        </w:rPr>
+        <w:t>36 browser tests passed</w:t>
+      </w:r>
+      <w:r>
+        <w:t xml:space="preserve"> with 8 intentional browser skips; focused CLI/core tests achieved </w:t>
       </w:r>
       <w:r>
         <w:rPr>
@@ -2197,7 +2206,7 @@
           <w:color w:val="17324D"/>
           <w:sz w:val="16"/>
         </w:rPr>
-        <w:t>27</w:t>
+        <w:t>28</w:t>
       </w:r>
     </w:p>
     <w:p>
@@ -2407,7 +2416,7 @@
           <w:color w:val="17324D"/>
           <w:sz w:val="16"/>
         </w:rPr>
-        <w:t>29</w:t>
+        <w:t>30</w:t>
       </w:r>
     </w:p>
     <w:p>
@@ -2754,7 +2763,7 @@
           <w:rPr>
             <w:color w:val="1F2933"/>
           </w:rPr>
-          <w:t>7.2: Improvement List</w:t>
+          <w:t>7.1.4: Error 7 Debugging</w:t>
         </w:r>
       </w:hyperlink>
       <w:r>
@@ -2784,7 +2793,7 @@
           <w:rPr>
             <w:color w:val="1F2933"/>
           </w:rPr>
-          <w:t>7.2.1: Improvement 1, 2, 3</w:t>
+          <w:t>7.2: Improvement List</w:t>
         </w:r>
       </w:hyperlink>
       <w:r>
@@ -2814,7 +2823,7 @@
           <w:rPr>
             <w:color w:val="1F2933"/>
           </w:rPr>
-          <w:t>7.3: Additional Feature</w:t>
+          <w:t>7.2.1: Improvement 1, 2, 3</w:t>
         </w:r>
       </w:hyperlink>
       <w:r>
@@ -2844,7 +2853,7 @@
           <w:rPr>
             <w:color w:val="1F2933"/>
           </w:rPr>
-          <w:t>7.4: Documentation</w:t>
+          <w:t>7.3: Additional Feature</w:t>
         </w:r>
       </w:hyperlink>
       <w:r>
@@ -2874,7 +2883,7 @@
           <w:rPr>
             <w:color w:val="1F2933"/>
           </w:rPr>
-          <w:t>7.4.1: User Manual</w:t>
+          <w:t>7.4: Documentation</w:t>
         </w:r>
       </w:hyperlink>
       <w:r>
@@ -2897,9 +2906,39 @@
           <w:tab w:pos="9864" w:val="right" w:leader="dot"/>
         </w:tabs>
         <w:spacing w:after="22"/>
+        <w:ind w:left="346"/>
+      </w:pPr>
+      <w:hyperlink w:anchor="h_76" w:history="1">
+        <w:r>
+          <w:rPr>
+            <w:color w:val="1F2933"/>
+          </w:rPr>
+          <w:t>7.4.1: User Manual</w:t>
+        </w:r>
+      </w:hyperlink>
+      <w:r>
+        <w:tab/>
+      </w:r>
+      <w:r>
+        <w:rPr>
+          <w:rFonts w:ascii="Arial" w:hAnsi="Arial" w:eastAsia="Arial"/>
+          <w:b w:val="0"/>
+          <w:color w:val="17324D"/>
+          <w:sz w:val="16"/>
+        </w:rPr>
+        <w:t>34</w:t>
+      </w:r>
+    </w:p>
+    <w:p>
+      <w:pPr>
+        <w:keepLines/>
+        <w:tabs>
+          <w:tab w:pos="9864" w:val="right" w:leader="dot"/>
+        </w:tabs>
+        <w:spacing w:after="22"/>
         <w:ind w:left="691"/>
       </w:pPr>
-      <w:hyperlink w:anchor="h_76" w:history="1">
+      <w:hyperlink w:anchor="h_77" w:history="1">
         <w:r>
           <w:rPr>
             <w:color w:val="1F2933"/>
@@ -2929,7 +2968,7 @@
         <w:spacing w:after="22"/>
         <w:ind w:left="691"/>
       </w:pPr>
-      <w:hyperlink w:anchor="h_77" w:history="1">
+      <w:hyperlink w:anchor="h_78" w:history="1">
         <w:r>
           <w:rPr>
             <w:color w:val="1F2933"/>
@@ -2959,7 +2998,7 @@
         <w:spacing w:after="22"/>
         <w:ind w:left="691"/>
       </w:pPr>
-      <w:hyperlink w:anchor="h_78" w:history="1">
+      <w:hyperlink w:anchor="h_79" w:history="1">
         <w:r>
           <w:rPr>
             <w:color w:val="1F2933"/>
@@ -2989,7 +3028,7 @@
         <w:spacing w:after="22"/>
         <w:ind w:left="691"/>
       </w:pPr>
-      <w:hyperlink w:anchor="h_79" w:history="1">
+      <w:hyperlink w:anchor="h_80" w:history="1">
         <w:r>
           <w:rPr>
             <w:color w:val="1F2933"/>
@@ -3019,7 +3058,7 @@
         <w:spacing w:after="22"/>
         <w:ind w:left="691"/>
       </w:pPr>
-      <w:hyperlink w:anchor="h_80" w:history="1">
+      <w:hyperlink w:anchor="h_81" w:history="1">
         <w:r>
           <w:rPr>
             <w:color w:val="1F2933"/>
@@ -3049,7 +3088,7 @@
         <w:spacing w:after="22"/>
         <w:ind w:left="346"/>
       </w:pPr>
-      <w:hyperlink w:anchor="h_81" w:history="1">
+      <w:hyperlink w:anchor="h_82" w:history="1">
         <w:r>
           <w:rPr>
             <w:color w:val="1F2933"/>
@@ -3067,7 +3106,7 @@
           <w:color w:val="17324D"/>
           <w:sz w:val="16"/>
         </w:rPr>
-        <w:t>34</w:t>
+        <w:t>35</w:t>
       </w:r>
     </w:p>
     <w:p>
@@ -3079,7 +3118,7 @@
         <w:spacing w:after="22"/>
         <w:ind w:left="0"/>
       </w:pPr>
-      <w:hyperlink w:anchor="h_82" w:history="1">
+      <w:hyperlink w:anchor="h_83" w:history="1">
         <w:r>
           <w:rPr>
             <w:color w:val="17324D"/>
@@ -3097,7 +3136,7 @@
           <w:color w:val="17324D"/>
           <w:sz w:val="16"/>
         </w:rPr>
-        <w:t>35</w:t>
+        <w:t>36</w:t>
       </w:r>
     </w:p>
     <w:p>
@@ -3109,7 +3148,7 @@
         <w:spacing w:after="22"/>
         <w:ind w:left="346"/>
       </w:pPr>
-      <w:hyperlink w:anchor="h_83" w:history="1">
+      <w:hyperlink w:anchor="h_84" w:history="1">
         <w:r>
           <w:rPr>
             <w:color w:val="1F2933"/>
@@ -3127,7 +3166,7 @@
           <w:color w:val="17324D"/>
           <w:sz w:val="16"/>
         </w:rPr>
-        <w:t>35</w:t>
+        <w:t>36</w:t>
       </w:r>
     </w:p>
     <w:p>
@@ -3139,7 +3178,7 @@
         <w:spacing w:after="22"/>
         <w:ind w:left="346"/>
       </w:pPr>
-      <w:hyperlink w:anchor="h_84" w:history="1">
+      <w:hyperlink w:anchor="h_85" w:history="1">
         <w:r>
           <w:rPr>
             <w:color w:val="1F2933"/>
@@ -3157,7 +3196,7 @@
           <w:color w:val="17324D"/>
           <w:sz w:val="16"/>
         </w:rPr>
-        <w:t>35</w:t>
+        <w:t>36</w:t>
       </w:r>
     </w:p>
     <w:p>
@@ -3169,7 +3208,7 @@
         <w:spacing w:after="22"/>
         <w:ind w:left="346"/>
       </w:pPr>
-      <w:hyperlink w:anchor="h_85" w:history="1">
+      <w:hyperlink w:anchor="h_86" w:history="1">
         <w:r>
           <w:rPr>
             <w:color w:val="1F2933"/>
@@ -3187,7 +3226,7 @@
           <w:color w:val="17324D"/>
           <w:sz w:val="16"/>
         </w:rPr>
-        <w:t>35</w:t>
+        <w:t>36</w:t>
       </w:r>
     </w:p>
     <w:p>
@@ -3199,7 +3238,7 @@
         <w:spacing w:after="22"/>
         <w:ind w:left="346"/>
       </w:pPr>
-      <w:hyperlink w:anchor="h_86" w:history="1">
+      <w:hyperlink w:anchor="h_87" w:history="1">
         <w:r>
           <w:rPr>
             <w:color w:val="1F2933"/>
@@ -3217,7 +3256,7 @@
           <w:color w:val="17324D"/>
           <w:sz w:val="16"/>
         </w:rPr>
-        <w:t>35</w:t>
+        <w:t>36</w:t>
       </w:r>
     </w:p>
     <w:p>
@@ -3229,7 +3268,7 @@
         <w:spacing w:after="22"/>
         <w:ind w:left="0"/>
       </w:pPr>
-      <w:hyperlink w:anchor="h_87" w:history="1">
+      <w:hyperlink w:anchor="h_88" w:history="1">
         <w:r>
           <w:rPr>
             <w:color w:val="17324D"/>
@@ -3247,7 +3286,7 @@
           <w:color w:val="17324D"/>
           <w:sz w:val="16"/>
         </w:rPr>
-        <w:t>36</w:t>
+        <w:t>37</w:t>
       </w:r>
     </w:p>
     <w:p>
@@ -3259,7 +3298,7 @@
         <w:spacing w:after="22"/>
         <w:ind w:left="346"/>
       </w:pPr>
-      <w:hyperlink w:anchor="h_88" w:history="1">
+      <w:hyperlink w:anchor="h_89" w:history="1">
         <w:r>
           <w:rPr>
             <w:color w:val="1F2933"/>
@@ -3277,7 +3316,7 @@
           <w:color w:val="17324D"/>
           <w:sz w:val="16"/>
         </w:rPr>
-        <w:t>36</w:t>
+        <w:t>37</w:t>
       </w:r>
     </w:p>
     <w:p>
@@ -3289,7 +3328,7 @@
         <w:spacing w:after="22"/>
         <w:ind w:left="346"/>
       </w:pPr>
-      <w:hyperlink w:anchor="h_89" w:history="1">
+      <w:hyperlink w:anchor="h_90" w:history="1">
         <w:r>
           <w:rPr>
             <w:color w:val="1F2933"/>
@@ -3307,7 +3346,7 @@
           <w:color w:val="17324D"/>
           <w:sz w:val="16"/>
         </w:rPr>
-        <w:t>36</w:t>
+        <w:t>37</w:t>
       </w:r>
     </w:p>
     <w:p>
@@ -3319,7 +3358,7 @@
         <w:spacing w:after="22"/>
         <w:ind w:left="346"/>
       </w:pPr>
-      <w:hyperlink w:anchor="h_90" w:history="1">
+      <w:hyperlink w:anchor="h_91" w:history="1">
         <w:r>
           <w:rPr>
             <w:color w:val="1F2933"/>
@@ -3337,7 +3376,7 @@
           <w:color w:val="17324D"/>
           <w:sz w:val="16"/>
         </w:rPr>
-        <w:t>36</w:t>
+        <w:t>37</w:t>
       </w:r>
     </w:p>
     <w:p>
@@ -3349,7 +3388,7 @@
         <w:spacing w:after="22"/>
         <w:ind w:left="346"/>
       </w:pPr>
-      <w:hyperlink w:anchor="h_91" w:history="1">
+      <w:hyperlink w:anchor="h_92" w:history="1">
         <w:r>
           <w:rPr>
             <w:color w:val="1F2933"/>
@@ -3367,7 +3406,7 @@
           <w:color w:val="17324D"/>
           <w:sz w:val="16"/>
         </w:rPr>
-        <w:t>36</w:t>
+        <w:t>37</w:t>
       </w:r>
     </w:p>
     <w:p>
@@ -4807,7 +4846,7 @@
                 <w:rFonts w:ascii="Arial" w:hAnsi="Arial" w:eastAsia="Arial"/>
                 <w:sz w:val="16"/>
               </w:rPr>
-              <w:t>136 passing tests overall; focused 92% measured coverage</w:t>
+              <w:t>117 Python and 36 browser tests passing; focused 92% coverage</w:t>
             </w:r>
           </w:p>
         </w:tc>
@@ -13432,7 +13471,7 @@
     </w:p>
     <w:p>
       <w:r>
-        <w:t xml:space="preserve">Testing was performed in three phases: environment and boundary readiness, rule and integration correctness, and end-user output acceptance. Automated evidence was generated from repository baseline </w:t>
+        <w:t xml:space="preserve">Testing was performed in three phases: environment and boundary readiness, rule and integration correctness, and end-user output acceptance. Automated evidence was refreshed from repository baseline </w:t>
       </w:r>
       <w:r>
         <w:rPr>
@@ -13441,10 +13480,10 @@
           <w:sz w:val="17"/>
           <w:noProof/>
         </w:rPr>
-        <w:t>31509d956b0bb8614b646887065ee40549238446</w:t>
-      </w:r>
-      <w:r>
-        <w:t xml:space="preserve"> on 1 September 2026. The complete suite reported 136 passed and 8 skipped in 8.01 seconds. Skips belong to optional infrastructure paths and are not hidden failures.</w:t>
+        <w:t>67b4cc9be06961483661bf3219626a4ea2e6014e</w:t>
+      </w:r>
+      <w:r>
+        <w:t xml:space="preserve"> on 1 September 2026. The successful GitHub Actions run executed 117 Python tests in 19.92 seconds with 99.72% branch-aware coverage of the canonical core, plus 36 browser end-to-end tests with 8 intentional browser/project skips. Ruff and mypy also passed across the complete Python source set. MongoDB and Redis are started by CI for service-level tests; the CLI-focused tests remain independent of those services.</w:t>
       </w:r>
     </w:p>
     <w:p>
@@ -16793,7 +16832,7 @@
     </w:p>
     <w:p>
       <w:r>
-        <w:t>Phase 2 verifies the computational core and integration between core, CLI, and local storage. The focused command covering core and CLI tests reported 53 passed in 0.54 seconds and 92% measured coverage for the selected source set. Core rule modules reached 100%; CLI storage reached 97%, the process entry point 83%, and the interactive application 75%.</w:t>
+        <w:t>Phase 2 verifies the computational core and integration between core, CLI, and local storage. The refreshed focused command covering core and CLI tests reported 56 passed in 0.53 seconds and 92% measured coverage for the selected source set. The canonical core reached 99% branch-aware coverage because one defensive branch remained partial; CLI storage reached 97%, the process entry point 83%, and the interactive application 75%.</w:t>
       </w:r>
     </w:p>
     <w:p>
@@ -18288,7 +18327,7 @@
     </w:p>
     <w:p>
       <w:r>
-        <w:t>This section records six concrete defect classes and the implementation safeguards that resolve them. Because the current repository is the verified baseline, the entries are a reconstruction from code boundaries and regression tests rather than a claim that each defect corresponds to a separately preserved historical commit.</w:t>
+        <w:t>This section records seven concrete defect classes and the implementation safeguards that resolve them. Because the current repository is the verified baseline, the entries are a reconstruction from code boundaries and regression tests rather than a claim that each defect corresponds to a separately preserved historical commit.</w:t>
       </w:r>
     </w:p>
     <w:p>
@@ -19284,6 +19323,135 @@
           </w:p>
         </w:tc>
       </w:tr>
+      <w:tr>
+        <w:trPr>
+          <w:cantSplit/>
+        </w:trPr>
+        <w:tc>
+          <w:tcPr>
+            <w:tcW w:type="dxa" w:w="1944"/>
+            <w:vAlign w:val="center"/>
+            <w:tcMar>
+              <w:top w:w="80" w:type="dxa"/>
+              <w:start w:w="100" w:type="dxa"/>
+              <w:bottom w:w="80" w:type="dxa"/>
+              <w:end w:w="100" w:type="dxa"/>
+            </w:tcMar>
+          </w:tcPr>
+          <w:p>
+            <w:pPr>
+              <w:spacing w:after="0"/>
+              <w:jc w:val="left"/>
+            </w:pPr>
+            <w:r>
+              <w:rPr>
+                <w:rFonts w:ascii="Arial" w:hAnsi="Arial" w:eastAsia="Arial"/>
+                <w:sz w:val="16"/>
+              </w:rPr>
+            </w:r>
+            <w:r>
+              <w:rPr>
+                <w:rFonts w:ascii="Arial" w:hAnsi="Arial" w:eastAsia="Arial"/>
+                <w:sz w:val="16"/>
+              </w:rPr>
+              <w:t>7</w:t>
+            </w:r>
+          </w:p>
+        </w:tc>
+        <w:tc>
+          <w:tcPr>
+            <w:tcW w:type="dxa" w:w="3096"/>
+            <w:vAlign w:val="center"/>
+            <w:tcMar>
+              <w:top w:w="80" w:type="dxa"/>
+              <w:start w:w="100" w:type="dxa"/>
+              <w:bottom w:w="80" w:type="dxa"/>
+              <w:end w:w="100" w:type="dxa"/>
+            </w:tcMar>
+          </w:tcPr>
+          <w:p>
+            <w:pPr>
+              <w:spacing w:after="0"/>
+              <w:jc w:val="left"/>
+            </w:pPr>
+            <w:r>
+              <w:rPr>
+                <w:rFonts w:ascii="Arial" w:hAnsi="Arial" w:eastAsia="Arial"/>
+                <w:sz w:val="16"/>
+              </w:rPr>
+            </w:r>
+            <w:r>
+              <w:rPr>
+                <w:rFonts w:ascii="Arial" w:hAnsi="Arial" w:eastAsia="Arial"/>
+                <w:sz w:val="16"/>
+              </w:rPr>
+              <w:t>Simultaneous duel guesses conflict or overwrite state</w:t>
+            </w:r>
+          </w:p>
+        </w:tc>
+        <w:tc>
+          <w:tcPr>
+            <w:tcW w:type="dxa" w:w="1872"/>
+            <w:vAlign w:val="center"/>
+            <w:tcMar>
+              <w:top w:w="80" w:type="dxa"/>
+              <w:start w:w="100" w:type="dxa"/>
+              <w:bottom w:w="80" w:type="dxa"/>
+              <w:end w:w="100" w:type="dxa"/>
+            </w:tcMar>
+          </w:tcPr>
+          <w:p>
+            <w:pPr>
+              <w:spacing w:after="0"/>
+              <w:jc w:val="left"/>
+            </w:pPr>
+            <w:r>
+              <w:rPr>
+                <w:rFonts w:ascii="Arial" w:hAnsi="Arial" w:eastAsia="Arial"/>
+                <w:sz w:val="16"/>
+              </w:rPr>
+            </w:r>
+            <w:r>
+              <w:rPr>
+                <w:rFonts w:ascii="Arial" w:hAnsi="Arial" w:eastAsia="Arial"/>
+                <w:sz w:val="16"/>
+              </w:rPr>
+              <w:t>Two API workers mutate one room document concurrently</w:t>
+            </w:r>
+          </w:p>
+        </w:tc>
+        <w:tc>
+          <w:tcPr>
+            <w:tcW w:type="dxa" w:w="2736"/>
+            <w:vAlign w:val="center"/>
+            <w:tcMar>
+              <w:top w:w="80" w:type="dxa"/>
+              <w:start w:w="100" w:type="dxa"/>
+              <w:bottom w:w="80" w:type="dxa"/>
+              <w:end w:w="100" w:type="dxa"/>
+            </w:tcMar>
+          </w:tcPr>
+          <w:p>
+            <w:pPr>
+              <w:spacing w:after="0"/>
+              <w:jc w:val="left"/>
+            </w:pPr>
+            <w:r>
+              <w:rPr>
+                <w:rFonts w:ascii="Arial" w:hAnsi="Arial" w:eastAsia="Arial"/>
+                <w:sz w:val="16"/>
+              </w:rPr>
+            </w:r>
+            <w:r>
+              <w:rPr>
+                <w:rFonts w:ascii="Arial" w:hAnsi="Arial" w:eastAsia="Arial"/>
+                <w:sz w:val="16"/>
+              </w:rPr>
+              <w:t>Serialize room attempts with a Redis lock and regression-test concurrent submissions</w:t>
+            </w:r>
+          </w:p>
+        </w:tc>
+      </w:tr>
     </w:tbl>
     <w:p>
       <w:pPr>
@@ -19500,9 +19668,41 @@
         <w:pStyle w:val="Heading2"/>
       </w:pPr>
       <w:r>
+        <w:t>7.1.4: Error 7 Debugging</w:t>
+      </w:r>
+      <w:bookmarkEnd w:id="71"/>
+    </w:p>
+    <w:p>
+      <w:r>
+        <w:t xml:space="preserve">Error 7 was found in the wider GUI/API path that shares the Mastermind engine. Two players could submit duel guesses at almost the same moment, allowing independent MongoDB transactions to contend for the same room and game state. The repair at commit </w:t>
+      </w:r>
+      <w:r>
+        <w:rPr>
+          <w:rFonts w:ascii="Menlo" w:hAnsi="Menlo"/>
+          <w:color w:val="17324D"/>
+          <w:sz w:val="17"/>
+          <w:noProof/>
+        </w:rPr>
+        <w:t>13fa42f0d9703f945881610a9a2d89ac7d31446f</w:t>
+      </w:r>
+      <w:r>
+        <w:t xml:space="preserve"> wraps the authoritative room-to-game mutation in a Redis lock named for the room. The five-second lease and blocking timeout bound failure, while the inner transaction preserves idempotency, attempt order, tie-window logic, and completion events.</w:t>
+      </w:r>
+    </w:p>
+    <w:p>
+      <w:r>
+        <w:t>Dedicated regression cases submit concurrent guesses, verify that both accepted attempts are retained exactly once, and confirm that retries remain idempotent. This repair does not change the standalone CLI's local game loop, but it matters to the installed GUI and therefore to the combined v1 package described in the user manual.</w:t>
+      </w:r>
+    </w:p>
+    <w:p>
+      <w:bookmarkStart w:id="72" w:name="h_72"/>
+      <w:pPr>
+        <w:pStyle w:val="Heading2"/>
+      </w:pPr>
+      <w:r>
         <w:t>7.2: Improvement List</w:t>
       </w:r>
-      <w:bookmarkEnd w:id="71"/>
+      <w:bookmarkEnd w:id="72"/>
     </w:p>
     <w:p>
       <w:r>
@@ -20467,14 +20667,14 @@
       </w:pPr>
     </w:p>
     <w:p>
-      <w:bookmarkStart w:id="72" w:name="h_72"/>
+      <w:bookmarkStart w:id="73" w:name="h_73"/>
       <w:pPr>
         <w:pStyle w:val="Heading2"/>
       </w:pPr>
       <w:r>
         <w:t>7.2.1: Improvement 1, 2, 3</w:t>
       </w:r>
-      <w:bookmarkEnd w:id="72"/>
+      <w:bookmarkEnd w:id="73"/>
     </w:p>
     <w:p>
       <w:r>
@@ -20504,14 +20704,14 @@
       </w:r>
     </w:p>
     <w:p>
-      <w:bookmarkStart w:id="73" w:name="h_73"/>
+      <w:bookmarkStart w:id="74" w:name="h_74"/>
       <w:pPr>
         <w:pStyle w:val="Heading2"/>
       </w:pPr>
       <w:r>
         <w:t>7.3: Additional Feature</w:t>
       </w:r>
-      <w:bookmarkEnd w:id="73"/>
+      <w:bookmarkEnd w:id="74"/>
     </w:p>
     <w:p>
       <w:r>
@@ -20520,18 +20720,30 @@
     </w:p>
     <w:p>
       <w:r>
-        <w:t>Other additions include pass-and-play with hidden secret input, four official presets plus Custom, a local high-score table, versioned score records, CSV formula protection, atomic export, malformed-data recovery, and cross-platform installers that include both CLI and GUI entry points. These features extend the minimum expectation without obscuring the game loop.</w:t>
-      </w:r>
-    </w:p>
-    <w:p>
-      <w:bookmarkStart w:id="74" w:name="h_74"/>
+        <w:t xml:space="preserve">Other additions include pass-and-play with hidden secret input, four official presets plus Custom, a local high-score table, versioned score records, CSV formula protection, atomic export, malformed-data recovery, and cross-platform installers that include both CLI and GUI entry points. The maintained v1.0.0 archives are rebuilt from the repaired source and contain </w:t>
+      </w:r>
+      <w:r>
+        <w:rPr>
+          <w:rFonts w:ascii="Menlo" w:hAnsi="Menlo"/>
+          <w:color w:val="17324D"/>
+          <w:sz w:val="17"/>
+          <w:noProof/>
+        </w:rPr>
+        <w:t>RELEASE.txt</w:t>
+      </w:r>
+      <w:r>
+        <w:t xml:space="preserve"> with the exact source commit, allowing the installed payload to be audited. These features extend the minimum expectation without obscuring the game loop.</w:t>
+      </w:r>
+    </w:p>
+    <w:p>
+      <w:bookmarkStart w:id="75" w:name="h_75"/>
       <w:pPr>
         <w:pStyle w:val="Heading2"/>
       </w:pPr>
       <w:r>
         <w:t>7.4: Documentation</w:t>
       </w:r>
-      <w:bookmarkEnd w:id="74"/>
+      <w:bookmarkEnd w:id="75"/>
     </w:p>
     <w:p>
       <w:r>
@@ -20539,24 +20751,24 @@
       </w:r>
     </w:p>
     <w:p>
-      <w:bookmarkStart w:id="75" w:name="h_75"/>
+      <w:bookmarkStart w:id="76" w:name="h_76"/>
       <w:pPr>
         <w:pStyle w:val="Heading2"/>
       </w:pPr>
       <w:r>
         <w:t>7.4.1: User Manual</w:t>
       </w:r>
-      <w:bookmarkEnd w:id="75"/>
-    </w:p>
-    <w:p>
-      <w:bookmarkStart w:id="76" w:name="h_76"/>
+      <w:bookmarkEnd w:id="76"/>
+    </w:p>
+    <w:p>
+      <w:bookmarkStart w:id="77" w:name="h_77"/>
       <w:pPr>
         <w:pStyle w:val="Heading3"/>
       </w:pPr>
       <w:r>
         <w:t>Installed application</w:t>
       </w:r>
-      <w:bookmarkEnd w:id="76"/>
+      <w:bookmarkEnd w:id="77"/>
     </w:p>
     <w:p>
       <w:pPr>
@@ -20580,6 +20792,30 @@
       </w:pPr>
       <w:r>
         <w:t>Choose the installation destination when prompted. The installer reports the GUI, CLI, service helper, bundled runtime, and supporting files it installs.</w:t>
+      </w:r>
+    </w:p>
+    <w:p>
+      <w:pPr>
+        <w:pStyle w:val="ListNumber"/>
+        <w:numPr>
+          <w:ilvl w:val="0"/>
+          <w:numId w:val="10"/>
+        </w:numPr>
+      </w:pPr>
+      <w:r>
+        <w:t xml:space="preserve">Open </w:t>
+      </w:r>
+      <w:r>
+        <w:rPr>
+          <w:rFonts w:ascii="Menlo" w:hAnsi="Menlo"/>
+          <w:color w:val="17324D"/>
+          <w:sz w:val="17"/>
+          <w:noProof/>
+        </w:rPr>
+        <w:t>RELEASE.txt</w:t>
+      </w:r>
+      <w:r>
+        <w:t xml:space="preserve"> in the extracted archive when build provenance is required; the refreshed package identifies v1.0.0 and its full source commit.</w:t>
       </w:r>
     </w:p>
     <w:p>
@@ -20679,14 +20915,14 @@
       </w:r>
     </w:p>
     <w:p>
-      <w:bookmarkStart w:id="77" w:name="h_77"/>
+      <w:bookmarkStart w:id="78" w:name="h_78"/>
       <w:pPr>
         <w:pStyle w:val="Heading3"/>
       </w:pPr>
       <w:r>
         <w:t>Development environment</w:t>
       </w:r>
-      <w:bookmarkEnd w:id="77"/>
+      <w:bookmarkEnd w:id="78"/>
     </w:p>
     <w:p>
       <w:r>
@@ -20749,14 +20985,14 @@
       </w:r>
     </w:p>
     <w:p>
-      <w:bookmarkStart w:id="78" w:name="h_78"/>
+      <w:bookmarkStart w:id="79" w:name="h_79"/>
       <w:pPr>
         <w:pStyle w:val="Heading3"/>
       </w:pPr>
       <w:r>
         <w:t>Playing a game</w:t>
       </w:r>
-      <w:bookmarkEnd w:id="78"/>
+      <w:bookmarkEnd w:id="79"/>
     </w:p>
     <w:p>
       <w:pPr>
@@ -20927,14 +21163,14 @@
       </w:r>
     </w:p>
     <w:p>
-      <w:bookmarkStart w:id="79" w:name="h_79"/>
+      <w:bookmarkStart w:id="80" w:name="h_80"/>
       <w:pPr>
         <w:pStyle w:val="Heading3"/>
       </w:pPr>
       <w:r>
         <w:t>Scores and exports</w:t>
       </w:r>
-      <w:bookmarkEnd w:id="79"/>
+      <w:bookmarkEnd w:id="80"/>
     </w:p>
     <w:p>
       <w:r>
@@ -20990,14 +21226,14 @@
       </w:r>
     </w:p>
     <w:p>
-      <w:bookmarkStart w:id="80" w:name="h_80"/>
+      <w:bookmarkStart w:id="81" w:name="h_81"/>
       <w:pPr>
         <w:pStyle w:val="Heading3"/>
       </w:pPr>
       <w:r>
         <w:t>Troubleshooting</w:t>
       </w:r>
-      <w:bookmarkEnd w:id="80"/>
+      <w:bookmarkEnd w:id="81"/>
     </w:p>
     <w:p>
       <w:pPr>
@@ -21064,14 +21300,14 @@
       </w:r>
     </w:p>
     <w:p>
-      <w:bookmarkStart w:id="81" w:name="h_81"/>
+      <w:bookmarkStart w:id="82" w:name="h_82"/>
       <w:pPr>
         <w:pStyle w:val="Heading2"/>
       </w:pPr>
       <w:r>
         <w:t>7.4.2: README File</w:t>
       </w:r>
-      <w:bookmarkEnd w:id="81"/>
+      <w:bookmarkEnd w:id="82"/>
     </w:p>
     <w:p>
       <w:r>
@@ -21091,14 +21327,14 @@
       </w:r>
     </w:p>
     <w:p>
-      <w:bookmarkStart w:id="82" w:name="h_82"/>
+      <w:bookmarkStart w:id="83" w:name="h_83"/>
       <w:pPr>
         <w:pStyle w:val="Heading1"/>
       </w:pPr>
       <w:r>
         <w:t>8: Conclusion</w:t>
       </w:r>
-      <w:bookmarkEnd w:id="82"/>
+      <w:bookmarkEnd w:id="83"/>
     </w:p>
     <w:p>
       <w:r>
@@ -21106,14 +21342,14 @@
       </w:r>
     </w:p>
     <w:p>
-      <w:bookmarkStart w:id="83" w:name="h_83"/>
+      <w:bookmarkStart w:id="84" w:name="h_84"/>
       <w:pPr>
         <w:pStyle w:val="Heading2"/>
       </w:pPr>
       <w:r>
         <w:t>8.1: Self-Reflection</w:t>
       </w:r>
-      <w:bookmarkEnd w:id="83"/>
+      <w:bookmarkEnd w:id="84"/>
     </w:p>
     <w:p>
       <w:r>
@@ -21126,14 +21362,14 @@
       </w:r>
     </w:p>
     <w:p>
-      <w:bookmarkStart w:id="84" w:name="h_84"/>
+      <w:bookmarkStart w:id="85" w:name="h_85"/>
       <w:pPr>
         <w:pStyle w:val="Heading2"/>
       </w:pPr>
       <w:r>
         <w:t>8.2: Program Evaluation</w:t>
       </w:r>
-      <w:bookmarkEnd w:id="84"/>
+      <w:bookmarkEnd w:id="85"/>
     </w:p>
     <w:p>
       <w:r>
@@ -21142,18 +21378,18 @@
     </w:p>
     <w:p>
       <w:r>
-        <w:t>Limitations remain. Local CSV is not designed for concurrent multi-process writing. Pass-and-play privacy depends on one terminal hand-off. The CLI uses letters rather than optional ANSI colour, and only summary data—not full attempt history—is exported. The interactive controller's 75% focused coverage is lower than the 100% core coverage. None prevents the stated use case, but each defines a credible next iteration.</w:t>
-      </w:r>
-    </w:p>
-    <w:p>
-      <w:bookmarkStart w:id="85" w:name="h_85"/>
+        <w:t>Limitations remain. Local CSV is not designed for concurrent multi-process writing. Pass-and-play privacy depends on one terminal hand-off. The CLI uses letters rather than optional ANSI colour, and only summary data—not full attempt history—is exported. The interactive controller's 75% focused coverage is lower than the core's 99% branch-aware coverage. None prevents the stated use case, but each defines a credible next iteration.</w:t>
+      </w:r>
+    </w:p>
+    <w:p>
+      <w:bookmarkStart w:id="86" w:name="h_86"/>
       <w:pPr>
         <w:pStyle w:val="Heading2"/>
       </w:pPr>
       <w:r>
         <w:t>8.3: Future Improvements</w:t>
       </w:r>
-      <w:bookmarkEnd w:id="85"/>
+      <w:bookmarkEnd w:id="86"/>
     </w:p>
     <w:p>
       <w:r>
@@ -21190,29 +21426,29 @@
       </w:r>
     </w:p>
     <w:p>
-      <w:bookmarkStart w:id="86" w:name="h_86"/>
+      <w:bookmarkStart w:id="87" w:name="h_87"/>
       <w:pPr>
         <w:pStyle w:val="Heading2"/>
       </w:pPr>
       <w:r>
         <w:t>8.4: Summary</w:t>
       </w:r>
-      <w:bookmarkEnd w:id="86"/>
-    </w:p>
-    <w:p>
-      <w:r>
-        <w:t>This project demonstrates the complete development cycle: a precise problem, parameter and constraint analysis, modular design, typed implementation, layered testing, debugging, user documentation, and critical evaluation. The measured baseline—136 passed tests, 8 intentional skips, focused 92% coverage, clean Ruff checks, and clean mypy checks—supports the conclusion that the CLI is fit for its documented local use.</w:t>
-      </w:r>
-    </w:p>
-    <w:p>
-      <w:bookmarkStart w:id="87" w:name="h_87"/>
+      <w:bookmarkEnd w:id="87"/>
+    </w:p>
+    <w:p>
+      <w:r>
+        <w:t>This project demonstrates the complete development cycle: a precise problem, parameter and constraint analysis, modular design, typed implementation, layered testing, debugging, user documentation, and critical evaluation. The refreshed baseline—117 passing Python tests, 36 passing browser tests with 8 intentional browser skips, focused 92% CLI/core coverage, clean Ruff checks, and clean mypy checks—supports the conclusion that the CLI is fit for its documented local use and that the combined v1 GUI/CLI package includes the repaired service path.</w:t>
+      </w:r>
+    </w:p>
+    <w:p>
+      <w:bookmarkStart w:id="88" w:name="h_88"/>
       <w:pPr>
         <w:pStyle w:val="Heading1"/>
       </w:pPr>
       <w:r>
         <w:t>9: Appendix</w:t>
       </w:r>
-      <w:bookmarkEnd w:id="87"/>
+      <w:bookmarkEnd w:id="88"/>
     </w:p>
     <w:p>
       <w:r>
@@ -21220,14 +21456,14 @@
       </w:r>
     </w:p>
     <w:p>
-      <w:bookmarkStart w:id="88" w:name="h_88"/>
+      <w:bookmarkStart w:id="89" w:name="h_89"/>
       <w:pPr>
         <w:pStyle w:val="Heading2"/>
       </w:pPr>
       <w:r>
         <w:t>9.1: References</w:t>
       </w:r>
-      <w:bookmarkEnd w:id="88"/>
+      <w:bookmarkEnd w:id="89"/>
     </w:p>
     <w:p>
       <w:r>
@@ -21235,14 +21471,14 @@
       </w:r>
     </w:p>
     <w:p>
-      <w:bookmarkStart w:id="89" w:name="h_89"/>
+      <w:bookmarkStart w:id="90" w:name="h_90"/>
       <w:pPr>
         <w:pStyle w:val="Heading2"/>
       </w:pPr>
       <w:r>
         <w:t>9.1.1: Books</w:t>
       </w:r>
-      <w:bookmarkEnd w:id="89"/>
+      <w:bookmarkEnd w:id="90"/>
     </w:p>
     <w:p>
       <w:pPr>
@@ -21308,14 +21544,14 @@
       </w:r>
     </w:p>
     <w:p>
-      <w:bookmarkStart w:id="90" w:name="h_90"/>
+      <w:bookmarkStart w:id="91" w:name="h_91"/>
       <w:pPr>
         <w:pStyle w:val="Heading2"/>
       </w:pPr>
       <w:r>
         <w:t>9.1.2: Websites</w:t>
       </w:r>
-      <w:bookmarkEnd w:id="90"/>
+      <w:bookmarkEnd w:id="91"/>
     </w:p>
     <w:p>
       <w:pPr>
@@ -21462,14 +21698,14 @@
       </w:r>
     </w:p>
     <w:p>
-      <w:bookmarkStart w:id="91" w:name="h_91"/>
+      <w:bookmarkStart w:id="92" w:name="h_92"/>
       <w:pPr>
         <w:pStyle w:val="Heading2"/>
       </w:pPr>
       <w:r>
         <w:t>9.2: Gantt Chart</w:t>
       </w:r>
-      <w:bookmarkEnd w:id="91"/>
+      <w:bookmarkEnd w:id="92"/>
     </w:p>
     <w:p>
       <w:r>
@@ -22213,7 +22449,7 @@
                 <w:rFonts w:ascii="Arial" w:hAnsi="Arial" w:eastAsia="Arial"/>
                 <w:sz w:val="16"/>
               </w:rPr>
-              <w:t>Six resolved defect classes and improvements</w:t>
+              <w:t>Seven resolved defect classes and improvements</w:t>
             </w:r>
           </w:p>
         </w:tc>
@@ -22383,7 +22619,7 @@
         <w:color w:val="647383"/>
         <w:sz w:val="16"/>
       </w:rPr>
-      <w:t>CLI-centred technical report  •  Baseline 31509d9</w:t>
+      <w:t>CLI-centred technical report  •  Baseline 67b4cc9</w:t>
     </w:r>
     <w:r>
       <w:tab/>

</xml_diff>

<commit_message>
docs(sba): refresh v1 CLI report
</commit_message>
<xml_diff>
--- a/docs/sba/mastermind-game-system-report/Mastermind_Game_System_SBA_Report.docx
+++ b/docs/sba/mastermind-game-system-report/Mastermind_Game_System_SBA_Report.docx
@@ -423,7 +423,7 @@
     </w:p>
     <w:p>
       <w:r>
-        <w:t>Technical statements are grounded in source code at commit 67b4cc9be06961483661bf3219626a4ea2e6014e and verification executed on 1 September 2026. This baseline includes the serialized concurrent-duel repair at commit 13fa42f0d9703f945881610a9a2d89ac7d31446f. The report does not claim that every reconstructed debugging scenario corresponds to an individually preserved historical commit; Section 7 identifies the final safeguards and their regression evidence.</w:t>
+        <w:t>Technical statements are grounded in source code at commit b3b37d360396ac66893333baf6f933578d9884b0 and verification executed on 1 September 2026. This baseline includes accessible CLI terminal colours and the serialized concurrent-duel repair at commit 13fa42f0d9703f945881610a9a2d89ac7d31446f. The report does not claim that every reconstructed debugging scenario corresponds to an individually preserved historical commit; Section 7 identifies the final safeguards and their regression evidence.</w:t>
       </w:r>
     </w:p>
     <w:tbl>
@@ -603,7 +603,7 @@
         <w:rPr>
           <w:b/>
         </w:rPr>
-        <w:t>117 Python tests passed</w:t>
+        <w:t>120 Python tests passed</w:t>
       </w:r>
       <w:r>
         <w:t xml:space="preserve"> and </w:t>
@@ -1966,7 +1966,7 @@
           <w:color w:val="17324D"/>
           <w:sz w:val="16"/>
         </w:rPr>
-        <w:t>21</w:t>
+        <w:t>22</w:t>
       </w:r>
     </w:p>
     <w:p>
@@ -1996,7 +1996,7 @@
           <w:color w:val="17324D"/>
           <w:sz w:val="16"/>
         </w:rPr>
-        <w:t>22</w:t>
+        <w:t>23</w:t>
       </w:r>
     </w:p>
     <w:p>
@@ -2026,7 +2026,7 @@
           <w:color w:val="17324D"/>
           <w:sz w:val="16"/>
         </w:rPr>
-        <w:t>22</w:t>
+        <w:t>23</w:t>
       </w:r>
     </w:p>
     <w:p>
@@ -3076,7 +3076,7 @@
           <w:color w:val="17324D"/>
           <w:sz w:val="16"/>
         </w:rPr>
-        <w:t>34</w:t>
+        <w:t>35</w:t>
       </w:r>
     </w:p>
     <w:p>
@@ -3532,7 +3532,7 @@
         <w:pStyle w:val="ListBullet"/>
       </w:pPr>
       <w:r>
-        <w:t>Figure 13. Source screenshot: menu dispatch and difficulty selection.</w:t>
+        <w:t>Figure 13. Source screenshot: accessible ANSI capability detection and peg formatting.</w:t>
       </w:r>
     </w:p>
     <w:p>
@@ -3889,7 +3889,7 @@
         <w:t>M</w:t>
       </w:r>
       <w:r>
-        <w:t xml:space="preserve">. A user may enter a compact code such as </w:t>
+        <w:t xml:space="preserve">. Interactive terminals style each letter in its matching colour, while the letter remains the authoritative value. A user may enter a compact code such as </w:t>
       </w:r>
       <w:r>
         <w:rPr>
@@ -4046,7 +4046,7 @@
         <w:pStyle w:val="ListBullet"/>
       </w:pPr>
       <w:r>
-        <w:t>display the complete attempt history and attempts remaining after every accepted guess;</w:t>
+        <w:t>display a colour-assisted, letter-labelled attempt history and attempts remaining after every accepted guess;</w:t>
       </w:r>
     </w:p>
     <w:p>
@@ -4814,7 +4814,7 @@
                 <w:rFonts w:ascii="Arial" w:hAnsi="Arial" w:eastAsia="Arial"/>
                 <w:sz w:val="16"/>
               </w:rPr>
-              <w:t>Manual checks</w:t>
+              <w:t>Automated checks</w:t>
             </w:r>
           </w:p>
         </w:tc>
@@ -4846,7 +4846,7 @@
                 <w:rFonts w:ascii="Arial" w:hAnsi="Arial" w:eastAsia="Arial"/>
                 <w:sz w:val="16"/>
               </w:rPr>
-              <w:t>117 Python and 36 browser tests passing; focused 92% coverage</w:t>
+              <w:t>120 Python and 36 browser tests passing; focused 92% coverage</w:t>
             </w:r>
           </w:p>
         </w:tc>
@@ -5707,7 +5707,43 @@
     </w:p>
     <w:p>
       <w:r>
-        <w:t xml:space="preserve">The terminal interface avoids relying on colour itself. Pegs are represented by stable letters, so the game remains usable in monochrome terminals and by users who cannot distinguish some colours. Human secret input uses </w:t>
+        <w:t xml:space="preserve">The terminal interface does not rely on colour alone. Pegs retain stable letters, while ANSI styling lets many players scan the palette and history more quickly. White and black identifiers use contrasting backgrounds. Redirected output, </w:t>
+      </w:r>
+      <w:r>
+        <w:rPr>
+          <w:rFonts w:ascii="Menlo" w:hAnsi="Menlo"/>
+          <w:color w:val="17324D"/>
+          <w:sz w:val="17"/>
+          <w:noProof/>
+        </w:rPr>
+        <w:t>TERM=dumb</w:t>
+      </w:r>
+      <w:r>
+        <w:t xml:space="preserve">, and </w:t>
+      </w:r>
+      <w:r>
+        <w:rPr>
+          <w:rFonts w:ascii="Menlo" w:hAnsi="Menlo"/>
+          <w:color w:val="17324D"/>
+          <w:sz w:val="17"/>
+          <w:noProof/>
+        </w:rPr>
+        <w:t>NO_COLOR</w:t>
+      </w:r>
+      <w:r>
+        <w:t xml:space="preserve"> remain plain text, and </w:t>
+      </w:r>
+      <w:r>
+        <w:rPr>
+          <w:rFonts w:ascii="Menlo" w:hAnsi="Menlo"/>
+          <w:color w:val="17324D"/>
+          <w:sz w:val="17"/>
+          <w:noProof/>
+        </w:rPr>
+        <w:t>FORCE_COLOR</w:t>
+      </w:r>
+      <w:r>
+        <w:t xml:space="preserve"> provides an explicit override. Human secret input uses </w:t>
       </w:r>
       <w:r>
         <w:rPr>
@@ -7403,7 +7439,57 @@
         <w:t>DomainError.message</w:t>
       </w:r>
       <w:r>
-        <w:t xml:space="preserve"> values rather than tracebacks or internal object representations. Tabular rows use explicit widths so values remain aligned for normal player names and settings.</w:t>
+        <w:t xml:space="preserve"> values rather than tracebacks or internal object representations. Tabular rows calculate padding from the unstyled guess, so invisible ANSI control sequences cannot shift the Black and White columns.</w:t>
+      </w:r>
+    </w:p>
+    <w:p>
+      <w:r>
+        <w:rPr>
+          <w:rFonts w:ascii="Menlo" w:hAnsi="Menlo"/>
+          <w:color w:val="17324D"/>
+          <w:sz w:val="17"/>
+          <w:noProof/>
+        </w:rPr>
+        <w:t>terminal.py</w:t>
+      </w:r>
+      <w:r>
+        <w:t xml:space="preserve"> maps all ten identifiers to readable ANSI styles and resets formatting after every letter. Capability detection enables styling only for an interactive stream, unless </w:t>
+      </w:r>
+      <w:r>
+        <w:rPr>
+          <w:rFonts w:ascii="Menlo" w:hAnsi="Menlo"/>
+          <w:color w:val="17324D"/>
+          <w:sz w:val="17"/>
+          <w:noProof/>
+        </w:rPr>
+        <w:t>FORCE_COLOR</w:t>
+      </w:r>
+      <w:r>
+        <w:t xml:space="preserve"> is set. </w:t>
+      </w:r>
+      <w:r>
+        <w:rPr>
+          <w:rFonts w:ascii="Menlo" w:hAnsi="Menlo"/>
+          <w:color w:val="17324D"/>
+          <w:sz w:val="17"/>
+          <w:noProof/>
+        </w:rPr>
+        <w:t>NO_COLOR</w:t>
+      </w:r>
+      <w:r>
+        <w:t xml:space="preserve"> and </w:t>
+      </w:r>
+      <w:r>
+        <w:rPr>
+          <w:rFonts w:ascii="Menlo" w:hAnsi="Menlo"/>
+          <w:color w:val="17324D"/>
+          <w:sz w:val="17"/>
+          <w:noProof/>
+        </w:rPr>
+        <w:t>TERM=dumb</w:t>
+      </w:r>
+      <w:r>
+        <w:t xml:space="preserve"> take priority. This keeps saved logs, pipes, automated tests, and assistive text workflows free of control sequences.</w:t>
       </w:r>
     </w:p>
     <w:p>
@@ -11375,7 +11461,56 @@
         <w:t>MastermindCLI</w:t>
       </w:r>
       <w:r>
-        <w:t xml:space="preserve"> is the application controller. Its constructor accepts four dependencies: normal input, hidden input, output, and score store. Its methods correspond to user tasks rather than low-level rules: run the menu, play a game, build Custom configuration, show scores, and export scores. Helper methods handle repeated numeric and yes/no prompting.</w:t>
+        <w:t xml:space="preserve"> is the application controller. Its constructor accepts normal input, hidden input, output, a score store, and an optional colour-output override. Its methods correspond to user tasks rather than low-level rules: run the menu, play a game, build Custom configuration, show scores, and export scores. Helper methods handle repeated numeric and yes/no prompting.</w:t>
+      </w:r>
+    </w:p>
+    <w:p>
+      <w:pPr>
+        <w:keepNext/>
+        <w:spacing w:before="100" w:after="40"/>
+        <w:jc w:val="center"/>
+      </w:pPr>
+      <w:r>
+        <w:drawing>
+          <wp:inline xmlns:a="http://schemas.openxmlformats.org/drawingml/2006/main" xmlns:pic="http://schemas.openxmlformats.org/drawingml/2006/picture">
+            <wp:extent cx="6080760" cy="3680460"/>
+            <wp:docPr id="14" name="Picture 14" descr="Figure 13. Source screenshot: accessible ANSI capability detection and peg formatting." title="Figure 13"/>
+            <wp:cNvGraphicFramePr>
+              <a:graphicFrameLocks noChangeAspect="1"/>
+            </wp:cNvGraphicFramePr>
+            <a:graphic>
+              <a:graphicData uri="http://schemas.openxmlformats.org/drawingml/2006/picture">
+                <pic:pic>
+                  <pic:nvPicPr>
+                    <pic:cNvPr id="0" name="code_cli_menu.png"/>
+                    <pic:cNvPicPr/>
+                  </pic:nvPicPr>
+                  <pic:blipFill>
+                    <a:blip r:embed="rId24"/>
+                    <a:stretch>
+                      <a:fillRect/>
+                    </a:stretch>
+                  </pic:blipFill>
+                  <pic:spPr>
+                    <a:xfrm>
+                      <a:off x="0" y="0"/>
+                      <a:ext cx="6080760" cy="3680460"/>
+                    </a:xfrm>
+                    <a:prstGeom prst="rect"/>
+                  </pic:spPr>
+                </pic:pic>
+              </a:graphicData>
+            </a:graphic>
+          </wp:inline>
+        </w:drawing>
+      </w:r>
+    </w:p>
+    <w:p>
+      <w:pPr>
+        <w:pStyle w:val="Caption"/>
+      </w:pPr>
+      <w:r>
+        <w:t>Figure 13. Source screenshot: accessible ANSI capability detection and peg formatting.</w:t>
       </w:r>
     </w:p>
     <w:p>
@@ -12717,55 +12852,6 @@
       </w:r>
     </w:p>
     <w:p>
-      <w:pPr>
-        <w:keepNext/>
-        <w:spacing w:before="100" w:after="40"/>
-        <w:jc w:val="center"/>
-      </w:pPr>
-      <w:r>
-        <w:drawing>
-          <wp:inline xmlns:a="http://schemas.openxmlformats.org/drawingml/2006/main" xmlns:pic="http://schemas.openxmlformats.org/drawingml/2006/picture">
-            <wp:extent cx="6080760" cy="3680460"/>
-            <wp:docPr id="14" name="Picture 14" descr="Figure 13. Source screenshot: menu dispatch and difficulty selection." title="Figure 13"/>
-            <wp:cNvGraphicFramePr>
-              <a:graphicFrameLocks noChangeAspect="1"/>
-            </wp:cNvGraphicFramePr>
-            <a:graphic>
-              <a:graphicData uri="http://schemas.openxmlformats.org/drawingml/2006/picture">
-                <pic:pic>
-                  <pic:nvPicPr>
-                    <pic:cNvPr id="0" name="code_cli_menu.png"/>
-                    <pic:cNvPicPr/>
-                  </pic:nvPicPr>
-                  <pic:blipFill>
-                    <a:blip r:embed="rId24"/>
-                    <a:stretch>
-                      <a:fillRect/>
-                    </a:stretch>
-                  </pic:blipFill>
-                  <pic:spPr>
-                    <a:xfrm>
-                      <a:off x="0" y="0"/>
-                      <a:ext cx="6080760" cy="3680460"/>
-                    </a:xfrm>
-                    <a:prstGeom prst="rect"/>
-                  </pic:spPr>
-                </pic:pic>
-              </a:graphicData>
-            </a:graphic>
-          </wp:inline>
-        </w:drawing>
-      </w:r>
-    </w:p>
-    <w:p>
-      <w:pPr>
-        <w:pStyle w:val="Caption"/>
-      </w:pPr>
-      <w:r>
-        <w:t>Figure 13. Source screenshot: menu dispatch and difficulty selection.</w:t>
-      </w:r>
-    </w:p>
-    <w:p>
       <w:r>
         <w:t xml:space="preserve">The pre-generation contract is simple: no </w:t>
       </w:r>
@@ -13480,10 +13566,10 @@
           <w:sz w:val="17"/>
           <w:noProof/>
         </w:rPr>
-        <w:t>67b4cc9be06961483661bf3219626a4ea2e6014e</w:t>
-      </w:r>
-      <w:r>
-        <w:t xml:space="preserve"> on 1 September 2026. The successful GitHub Actions run executed 117 Python tests in 19.92 seconds with 99.72% branch-aware coverage of the canonical core, plus 36 browser end-to-end tests with 8 intentional browser/project skips. Ruff and mypy also passed across the complete Python source set. MongoDB and Redis are started by CI for service-level tests; the CLI-focused tests remain independent of those services.</w:t>
+        <w:t>b3b37d360396ac66893333baf6f933578d9884b0</w:t>
+      </w:r>
+      <w:r>
+        <w:t xml:space="preserve"> on 1 September 2026. The successful GitHub Actions run executed 120 Python tests with 99.72% branch-aware coverage of the canonical core, plus 36 browser end-to-end tests with 8 intentional browser/project skips. Ruff and mypy also passed across the complete Python source set. MongoDB and Redis are started by CI for service-level tests; the CLI-focused tests remain independent of those services.</w:t>
       </w:r>
     </w:p>
     <w:p>
@@ -14313,7 +14399,7 @@
     </w:p>
     <w:p>
       <w:r>
-        <w:t>The project environment was synchronized from the lockfile and the CLI/core modules were imported through pytest discovery. The complete suite collected and executed successfully. Ruff also resolved the same package structure, and mypy checked 13 focused source files without import errors.</w:t>
+        <w:t>The project environment was synchronized from the lockfile and the CLI/core modules were imported through pytest discovery. The complete suite collected and executed successfully. Ruff also resolved the same package structure, and mypy checked 14 focused source files without import errors.</w:t>
       </w:r>
     </w:p>
     <w:tbl>
@@ -15018,7 +15104,7 @@
                 <w:rFonts w:ascii="Arial" w:hAnsi="Arial" w:eastAsia="Arial"/>
                 <w:sz w:val="16"/>
               </w:rPr>
-              <w:t>13 files passed</w:t>
+              <w:t>14 files passed</w:t>
             </w:r>
           </w:p>
         </w:tc>
@@ -16832,7 +16918,7 @@
     </w:p>
     <w:p>
       <w:r>
-        <w:t>Phase 2 verifies the computational core and integration between core, CLI, and local storage. The refreshed focused command covering core and CLI tests reported 56 passed in 0.53 seconds and 92% measured coverage for the selected source set. The canonical core reached 99% branch-aware coverage because one defensive branch remained partial; CLI storage reached 97%, the process entry point 83%, and the interactive application 75%.</w:t>
+        <w:t>Phase 2 verifies the computational core and integration between core, CLI, and local storage. The refreshed focused command covering core and CLI tests reported 59 passed in 0.57 seconds and 92% measured coverage for the selected source set. The canonical core reached 99% branch-aware coverage because one defensive branch remained partial; CLI storage reached 97%, the terminal formatter reached 93%, the process entry point 83%, and the interactive application 76%.</w:t>
       </w:r>
     </w:p>
     <w:p>
@@ -17108,7 +17194,43 @@
         <w:t>tmp_path</w:t>
       </w:r>
       <w:r>
-        <w:t>. They exercise the real controller rather than mocking the core. One scenario plays to a win and verifies the printed attempt table and saved result. Others test invalid setup, pass-and-play, score display, export, and storage warnings.</w:t>
+        <w:t xml:space="preserve">. They exercise the real controller rather than mocking the core. One scenario plays to a win and verifies the printed attempt table and saved result. Others test invalid setup, pass-and-play, score display, export, and storage warnings. Colour-specific cases verify all ten ANSI mappings, automatic terminal detection, </w:t>
+      </w:r>
+      <w:r>
+        <w:rPr>
+          <w:rFonts w:ascii="Menlo" w:hAnsi="Menlo"/>
+          <w:color w:val="17324D"/>
+          <w:sz w:val="17"/>
+          <w:noProof/>
+        </w:rPr>
+        <w:t>NO_COLOR</w:t>
+      </w:r>
+      <w:r>
+        <w:t xml:space="preserve">, </w:t>
+      </w:r>
+      <w:r>
+        <w:rPr>
+          <w:rFonts w:ascii="Menlo" w:hAnsi="Menlo"/>
+          <w:color w:val="17324D"/>
+          <w:sz w:val="17"/>
+          <w:noProof/>
+        </w:rPr>
+        <w:t>TERM=dumb</w:t>
+      </w:r>
+      <w:r>
+        <w:t xml:space="preserve">, </w:t>
+      </w:r>
+      <w:r>
+        <w:rPr>
+          <w:rFonts w:ascii="Menlo" w:hAnsi="Menlo"/>
+          <w:color w:val="17324D"/>
+          <w:sz w:val="17"/>
+          <w:noProof/>
+        </w:rPr>
+        <w:t>FORCE_COLOR</w:t>
+      </w:r>
+      <w:r>
+        <w:t>, plain fallback, and aligned history output.</w:t>
       </w:r>
     </w:p>
     <w:p>
@@ -17284,7 +17406,7 @@
     </w:p>
     <w:p>
       <w:r>
-        <w:t xml:space="preserve">Print tests assert the five menu choices, rules text, configuration summary, attempt-table labels, pluralization, terminal status message, score, and export confirmation. Export tests read the actual target with </w:t>
+        <w:t xml:space="preserve">Print tests assert the five menu choices, rules text, coloured and plain configuration summaries, attempt-table labels and alignment, pluralization, terminal status message, score, and export confirmation. Export tests read the actual target with </w:t>
       </w:r>
       <w:r>
         <w:rPr>
@@ -18312,7 +18434,7 @@
     </w:p>
     <w:p>
       <w:r>
-        <w:t>The main usability limitation is the text-only representation of colours. Letter identifiers are unambiguous and accessible in monochrome, but new players must learn the legend. The GUI offers a more visual alternative while sharing the same rules.</w:t>
+        <w:t>The colour-assisted letter representation reduces the main CLI usability gap. Players can scan familiar colours without losing the unambiguous identifiers needed in monochrome terminals, copied logs, and accessible text workflows. The GUI remains the more visual alternative and shares the same rules.</w:t>
       </w:r>
     </w:p>
     <w:p>
@@ -20329,7 +20451,7 @@
                 <w:rFonts w:ascii="Arial" w:hAnsi="Arial" w:eastAsia="Arial"/>
                 <w:sz w:val="16"/>
               </w:rPr>
-              <w:t>Add accessible coloured terminal symbols optionally</w:t>
+              <w:t>Maintain accessible terminal colour styling</w:t>
             </w:r>
           </w:p>
         </w:tc>
@@ -20393,7 +20515,7 @@
                 <w:rFonts w:ascii="Arial" w:hAnsi="Arial" w:eastAsia="Arial"/>
                 <w:sz w:val="16"/>
               </w:rPr>
-              <w:t>Terminal capability detection</w:t>
+              <w:t>Preserve plain fallback and alignment</w:t>
             </w:r>
           </w:p>
         </w:tc>
@@ -20736,6 +20858,11 @@
       </w:r>
     </w:p>
     <w:p>
+      <w:r>
+        <w:t>The v1 CLI also adds accessible terminal colour rendering without a third-party dependency. The palette, accepted guesses, and lost-game reveal use the same formatter. Letter identifiers remain visible, black and white use contrast backgrounds, and automatic plain-text fallback keeps redirected output stable. Three new regression tests cover the formatter, capability policy, and a complete coloured game output path.</w:t>
+      </w:r>
+    </w:p>
+    <w:p>
       <w:bookmarkStart w:id="75" w:name="h_75"/>
       <w:pPr>
         <w:pStyle w:val="Heading2"/>
@@ -21135,6 +21262,42 @@
         </w:numPr>
       </w:pPr>
       <w:r>
+        <w:t xml:space="preserve">In an interactive terminal, the letters appear in their matching colours. Set </w:t>
+      </w:r>
+      <w:r>
+        <w:rPr>
+          <w:rFonts w:ascii="Menlo" w:hAnsi="Menlo"/>
+          <w:color w:val="17324D"/>
+          <w:sz w:val="17"/>
+          <w:noProof/>
+        </w:rPr>
+        <w:t>NO_COLOR=1</w:t>
+      </w:r>
+      <w:r>
+        <w:t xml:space="preserve"> before </w:t>
+      </w:r>
+      <w:r>
+        <w:rPr>
+          <w:rFonts w:ascii="Menlo" w:hAnsi="Menlo"/>
+          <w:color w:val="17324D"/>
+          <w:sz w:val="17"/>
+          <w:noProof/>
+        </w:rPr>
+        <w:t>cipherboard</w:t>
+      </w:r>
+      <w:r>
+        <w:t xml:space="preserve"> when plain output is preferred.</w:t>
+      </w:r>
+    </w:p>
+    <w:p>
+      <w:pPr>
+        <w:pStyle w:val="ListNumber"/>
+        <w:numPr>
+          <w:ilvl w:val="0"/>
+          <w:numId w:val="11"/>
+        </w:numPr>
+      </w:pPr>
+      <w:r>
         <w:t>Read black as correct colour and position; read white as correct colour but different position.</w:t>
       </w:r>
     </w:p>
@@ -21288,6 +21451,38 @@
         <w:pStyle w:val="ListBullet"/>
       </w:pPr>
       <w:r>
+        <w:t xml:space="preserve">If colour is unavailable or unsuitable, the letters still identify every peg. Use </w:t>
+      </w:r>
+      <w:r>
+        <w:rPr>
+          <w:rFonts w:ascii="Menlo" w:hAnsi="Menlo"/>
+          <w:color w:val="17324D"/>
+          <w:sz w:val="17"/>
+          <w:noProof/>
+        </w:rPr>
+        <w:t>NO_COLOR=1 cipherboard</w:t>
+      </w:r>
+      <w:r>
+        <w:t xml:space="preserve"> on macOS/Linux or </w:t>
+      </w:r>
+      <w:r>
+        <w:rPr>
+          <w:rFonts w:ascii="Menlo" w:hAnsi="Menlo"/>
+          <w:color w:val="17324D"/>
+          <w:sz w:val="17"/>
+          <w:noProof/>
+        </w:rPr>
+        <w:t>$env:NO_COLOR=1; cipherboard</w:t>
+      </w:r>
+      <w:r>
+        <w:t xml:space="preserve"> in PowerShell for plain output.</w:t>
+      </w:r>
+    </w:p>
+    <w:p>
+      <w:pPr>
+        <w:pStyle w:val="ListBullet"/>
+      </w:pPr>
+      <w:r>
         <w:t>If a save/export warning appears, check directory permissions and free space. The game result is still displayed.</w:t>
       </w:r>
     </w:p>
@@ -21378,7 +21573,7 @@
     </w:p>
     <w:p>
       <w:r>
-        <w:t>Limitations remain. Local CSV is not designed for concurrent multi-process writing. Pass-and-play privacy depends on one terminal hand-off. The CLI uses letters rather than optional ANSI colour, and only summary data—not full attempt history—is exported. The interactive controller's 75% focused coverage is lower than the core's 99% branch-aware coverage. None prevents the stated use case, but each defines a credible next iteration.</w:t>
+        <w:t>Limitations remain. Local CSV is not designed for concurrent multi-process writing. Pass-and-play privacy depends on one terminal hand-off. Some terminals cannot display ANSI styling, so the CLI must retain letter identifiers and plain fallback. Only summary data, not full attempt history, is exported. The interactive controller's 76% focused coverage is lower than the core's 99% branch-aware coverage. None prevents the stated use case, but each defines a credible next iteration.</w:t>
       </w:r>
     </w:p>
     <w:p>
@@ -21393,7 +21588,7 @@
     </w:p>
     <w:p>
       <w:r>
-        <w:t>Future work should prioritize an explicit storage schema version with migration and locking, broader controller-path tests, optional accessible ANSI styling, JSON attempt-history export, and separate-device Code Maker/Code Breaker sessions. Packaging should add automated signing and notarization verification on macOS and signed installer validation on Windows.</w:t>
+        <w:t>Future work should prioritize an explicit storage schema version with migration and locking, broader controller-path tests, JSON attempt-history export, and separate-device Code Maker/Code Breaker sessions. Terminal work could add user-configurable themes while keeping the current contrast and plain-output guarantees. Packaging should add automated signing and notarization verification on macOS and signed installer validation on Windows.</w:t>
       </w:r>
     </w:p>
     <w:p>
@@ -21437,7 +21632,7 @@
     </w:p>
     <w:p>
       <w:r>
-        <w:t>This project demonstrates the complete development cycle: a precise problem, parameter and constraint analysis, modular design, typed implementation, layered testing, debugging, user documentation, and critical evaluation. The refreshed baseline—117 passing Python tests, 36 passing browser tests with 8 intentional browser skips, focused 92% CLI/core coverage, clean Ruff checks, and clean mypy checks—supports the conclusion that the CLI is fit for its documented local use and that the combined v1 GUI/CLI package includes the repaired service path.</w:t>
+        <w:t>This project demonstrates the complete development cycle: a precise problem, parameter and constraint analysis, modular design, typed implementation, layered testing, debugging, user documentation, and critical evaluation. The refreshed baseline, with 120 passing Python tests, 36 passing browser tests, 8 intentional browser skips, focused 92% CLI/core coverage, clean Ruff checks, and clean mypy checks, supports the conclusion that the CLI is fit for its documented local use and that the combined v1 GUI/CLI package includes the repaired service path and accessible terminal colours.</w:t>
       </w:r>
     </w:p>
     <w:p>
@@ -22619,7 +22814,7 @@
         <w:color w:val="647383"/>
         <w:sz w:val="16"/>
       </w:rPr>
-      <w:t>CLI-centred technical report  •  Baseline 67b4cc9</w:t>
+      <w:t>CLI-centred technical report  •  Baseline b3b37d3</w:t>
     </w:r>
     <w:r>
       <w:tab/>

</xml_diff>